<commit_message>
perf: optimize admin dashboard query and fix staff dashboard role check
</commit_message>
<xml_diff>
--- a/Panduan_Pengguna_Dan_FAQ.docx
+++ b/Panduan_Pengguna_Dan_FAQ.docx
@@ -6,20 +6,38 @@
       <w:pPr>
         <w:pStyle w:val="Title"/>
         <w:jc w:val="center"/>
+        <w:rPr>
+          <w:lang w:val="sv-SE"/>
+        </w:rPr>
       </w:pPr>
       <w:r>
-        <w:t xml:space="preserve">MANUAL PENGGUNA </w:t>
-      </w:r>
-      <w:r>
+        <w:rPr>
+          <w:lang w:val="sv-SE"/>
+        </w:rPr>
+        <w:t xml:space="preserve">MANUAL </w:t>
+      </w:r>
+      <w:r>
+        <w:rPr>
+          <w:lang w:val="sv-SE"/>
+        </w:rPr>
         <w:t>RINGKAS</w:t>
       </w:r>
       <w:r>
+        <w:rPr>
+          <w:lang w:val="sv-SE"/>
+        </w:rPr>
         <w:t xml:space="preserve"> </w:t>
       </w:r>
       <w:r>
-        <w:t>&amp; SOALAN LAZIM (FAQ)</w:t>
-      </w:r>
-      <w:r>
+        <w:rPr>
+          <w:lang w:val="sv-SE"/>
+        </w:rPr>
+        <w:t>PENGGUNA &amp; SOALAN LAZIM (FAQ)</w:t>
+      </w:r>
+      <w:r>
+        <w:rPr>
+          <w:lang w:val="sv-SE"/>
+        </w:rPr>
         <w:br/>
         <w:t>SISTEM E-ZAKAT OCR JUZWAB</w:t>
       </w:r>
@@ -106,13 +124,7 @@
         <w:rPr>
           <w:lang w:val="sv-SE"/>
         </w:rPr>
-        <w:t xml:space="preserve">Muat Naik Data – </w:t>
-      </w:r>
-      <w:r>
-        <w:rPr>
-          <w:lang w:val="sv-SE"/>
-        </w:rPr>
-        <w:t>Anda boleh mendaftarkan amil secara pukal (Bulk Upload)</w:t>
+        <w:t>Muat Naik Data – Anda boleh mendaftarkan amil secara pukal (Bulk Upload)</w:t>
       </w:r>
     </w:p>
     <w:p>
@@ -156,19 +168,7 @@
         <w:rPr>
           <w:lang w:val="sv-SE"/>
         </w:rPr>
-        <w:t>Pengurusan Tetapan</w:t>
-      </w:r>
-      <w:r>
-        <w:rPr>
-          <w:lang w:val="sv-SE"/>
-        </w:rPr>
-        <w:t xml:space="preserve"> (Setting)</w:t>
-      </w:r>
-      <w:r>
-        <w:rPr>
-          <w:lang w:val="sv-SE"/>
-        </w:rPr>
-        <w:t xml:space="preserve"> - menyelaras kadar harga beras (Fitrah), dan menyegerakkan </w:t>
+        <w:t xml:space="preserve">Pengurusan Tetapan (Setting) - menyelaras kadar harga beras (Fitrah), dan menyegerakkan </w:t>
       </w:r>
       <w:r>
         <w:rPr>
@@ -969,6 +969,255 @@
           <w:lang w:val="sv-SE"/>
         </w:rPr>
       </w:pPr>
+    </w:p>
+    <w:p>
+      <w:pPr>
+        <w:jc w:val="both"/>
+        <w:rPr>
+          <w:lang w:val="sv-SE"/>
+        </w:rPr>
+      </w:pPr>
+    </w:p>
+    <w:p>
+      <w:pPr>
+        <w:rPr>
+          <w:lang w:val="sv-SE"/>
+        </w:rPr>
+      </w:pPr>
+    </w:p>
+    <w:p>
+      <w:pPr>
+        <w:rPr>
+          <w:lang w:val="sv-SE"/>
+        </w:rPr>
+      </w:pPr>
+    </w:p>
+    <w:p>
+      <w:pPr>
+        <w:rPr>
+          <w:lang w:val="en-GB"/>
+        </w:rPr>
+      </w:pPr>
+    </w:p>
+    <w:p>
+      <w:pPr>
+        <w:rPr>
+          <w:lang w:val="en-GB"/>
+        </w:rPr>
+      </w:pPr>
+    </w:p>
+    <w:p>
+      <w:pPr>
+        <w:rPr>
+          <w:lang w:val="en-GB"/>
+        </w:rPr>
+      </w:pPr>
+    </w:p>
+    <w:p>
+      <w:pPr>
+        <w:rPr>
+          <w:lang w:val="en-GB"/>
+        </w:rPr>
+      </w:pPr>
+    </w:p>
+    <w:p>
+      <w:pPr>
+        <w:rPr>
+          <w:lang w:val="en-GB"/>
+        </w:rPr>
+      </w:pPr>
+    </w:p>
+    <w:p>
+      <w:pPr>
+        <w:rPr>
+          <w:lang w:val="en-GB"/>
+        </w:rPr>
+      </w:pPr>
+    </w:p>
+    <w:p>
+      <w:pPr>
+        <w:rPr>
+          <w:lang w:val="en-GB"/>
+        </w:rPr>
+      </w:pPr>
+    </w:p>
+    <w:p>
+      <w:pPr>
+        <w:rPr>
+          <w:lang w:val="en-GB"/>
+        </w:rPr>
+      </w:pPr>
+      <w:r>
+        <w:rPr>
+          <w:lang w:val="en-GB"/>
+        </w:rPr>
+        <w:lastRenderedPageBreak/>
+        <w:t xml:space="preserve">If going </w:t>
+      </w:r>
+      <w:proofErr w:type="spellStart"/>
+      <w:r>
+        <w:rPr>
+          <w:lang w:val="en-GB"/>
+        </w:rPr>
+        <w:t>bzck</w:t>
+      </w:r>
+      <w:proofErr w:type="spellEnd"/>
+      <w:r>
+        <w:rPr>
+          <w:lang w:val="en-GB"/>
+        </w:rPr>
+        <w:t xml:space="preserve"> (</w:t>
+      </w:r>
+      <w:proofErr w:type="spellStart"/>
+      <w:r>
+        <w:rPr>
+          <w:lang w:val="en-GB"/>
+        </w:rPr>
+        <w:t>butang</w:t>
+      </w:r>
+      <w:proofErr w:type="spellEnd"/>
+      <w:r>
+        <w:rPr>
+          <w:lang w:val="en-GB"/>
+        </w:rPr>
+        <w:t xml:space="preserve"> </w:t>
+      </w:r>
+      <w:proofErr w:type="spellStart"/>
+      <w:r>
+        <w:rPr>
+          <w:lang w:val="en-GB"/>
+        </w:rPr>
+        <w:t>kembali</w:t>
+      </w:r>
+      <w:proofErr w:type="spellEnd"/>
+      <w:r>
+        <w:rPr>
+          <w:lang w:val="en-GB"/>
+        </w:rPr>
+        <w:t>)</w:t>
+      </w:r>
+    </w:p>
+    <w:p>
+      <w:pPr>
+        <w:rPr>
+          <w:lang w:val="en-GB"/>
+        </w:rPr>
+      </w:pPr>
+      <w:r>
+        <w:rPr>
+          <w:lang w:val="en-GB"/>
+        </w:rPr>
+        <w:drawing>
+          <wp:inline distT="0" distB="0" distL="0" distR="0" wp14:anchorId="4A7384F9" wp14:editId="7779B66E">
+            <wp:extent cx="5486400" cy="5292090"/>
+            <wp:effectExtent l="0" t="0" r="0" b="3810"/>
+            <wp:docPr id="244889612" name="Picture 1"/>
+            <wp:cNvGraphicFramePr>
+              <a:graphicFrameLocks xmlns:a="http://schemas.openxmlformats.org/drawingml/2006/main" noChangeAspect="1"/>
+            </wp:cNvGraphicFramePr>
+            <a:graphic xmlns:a="http://schemas.openxmlformats.org/drawingml/2006/main">
+              <a:graphicData uri="http://schemas.openxmlformats.org/drawingml/2006/picture">
+                <pic:pic xmlns:pic="http://schemas.openxmlformats.org/drawingml/2006/picture">
+                  <pic:nvPicPr>
+                    <pic:cNvPr id="244889612" name=""/>
+                    <pic:cNvPicPr/>
+                  </pic:nvPicPr>
+                  <pic:blipFill>
+                    <a:blip r:embed="rId6"/>
+                    <a:stretch>
+                      <a:fillRect/>
+                    </a:stretch>
+                  </pic:blipFill>
+                  <pic:spPr>
+                    <a:xfrm>
+                      <a:off x="0" y="0"/>
+                      <a:ext cx="5486400" cy="5292090"/>
+                    </a:xfrm>
+                    <a:prstGeom prst="rect">
+                      <a:avLst/>
+                    </a:prstGeom>
+                  </pic:spPr>
+                </pic:pic>
+              </a:graphicData>
+            </a:graphic>
+          </wp:inline>
+        </w:drawing>
+      </w:r>
+    </w:p>
+    <w:p>
+      <w:pPr>
+        <w:rPr>
+          <w:lang w:val="en-GB"/>
+        </w:rPr>
+      </w:pPr>
+      <w:r>
+        <w:rPr>
+          <w:lang w:val="en-GB"/>
+        </w:rPr>
+        <w:t xml:space="preserve">Then </w:t>
+      </w:r>
+      <w:proofErr w:type="spellStart"/>
+      <w:r>
+        <w:rPr>
+          <w:lang w:val="en-GB"/>
+        </w:rPr>
+        <w:t>keluar</w:t>
+      </w:r>
+      <w:proofErr w:type="spellEnd"/>
+      <w:r>
+        <w:rPr>
+          <w:lang w:val="en-GB"/>
+        </w:rPr>
+        <w:t xml:space="preserve"> Error 1101</w:t>
+      </w:r>
+    </w:p>
+    <w:p>
+      <w:pPr>
+        <w:rPr>
+          <w:lang w:val="en-GB"/>
+        </w:rPr>
+      </w:pPr>
+      <w:r>
+        <w:rPr>
+          <w:lang w:val="sv-SE"/>
+        </w:rPr>
+        <w:lastRenderedPageBreak/>
+        <w:drawing>
+          <wp:inline distT="0" distB="0" distL="0" distR="0" wp14:anchorId="2C347105" wp14:editId="5BDC7CDF">
+            <wp:extent cx="5486400" cy="4972050"/>
+            <wp:effectExtent l="0" t="0" r="0" b="0"/>
+            <wp:docPr id="1517785991" name="Picture 1"/>
+            <wp:cNvGraphicFramePr>
+              <a:graphicFrameLocks xmlns:a="http://schemas.openxmlformats.org/drawingml/2006/main" noChangeAspect="1"/>
+            </wp:cNvGraphicFramePr>
+            <a:graphic xmlns:a="http://schemas.openxmlformats.org/drawingml/2006/main">
+              <a:graphicData uri="http://schemas.openxmlformats.org/drawingml/2006/picture">
+                <pic:pic xmlns:pic="http://schemas.openxmlformats.org/drawingml/2006/picture">
+                  <pic:nvPicPr>
+                    <pic:cNvPr id="1517785991" name=""/>
+                    <pic:cNvPicPr/>
+                  </pic:nvPicPr>
+                  <pic:blipFill>
+                    <a:blip r:embed="rId7"/>
+                    <a:stretch>
+                      <a:fillRect/>
+                    </a:stretch>
+                  </pic:blipFill>
+                  <pic:spPr>
+                    <a:xfrm>
+                      <a:off x="0" y="0"/>
+                      <a:ext cx="5486400" cy="4972050"/>
+                    </a:xfrm>
+                    <a:prstGeom prst="rect">
+                      <a:avLst/>
+                    </a:prstGeom>
+                  </pic:spPr>
+                </pic:pic>
+              </a:graphicData>
+            </a:graphic>
+          </wp:inline>
+        </w:drawing>
+      </w:r>
     </w:p>
     <w:sectPr>
       <w:pgSz w:w="12240" w:h="15840"/>

</xml_diff>

<commit_message>
feat: add test-sharepoint API route and admin connection confirmation button for SharePoint site
</commit_message>
<xml_diff>
--- a/Panduan_Pengguna_Dan_FAQ.docx
+++ b/Panduan_Pengguna_Dan_FAQ.docx
@@ -20,13 +20,7 @@
         <w:rPr>
           <w:lang w:val="sv-SE"/>
         </w:rPr>
-        <w:t>RINGKAS</w:t>
-      </w:r>
-      <w:r>
-        <w:rPr>
-          <w:lang w:val="sv-SE"/>
-        </w:rPr>
-        <w:t xml:space="preserve"> </w:t>
+        <w:t xml:space="preserve">RINGKAS </w:t>
       </w:r>
       <w:r>
         <w:rPr>
@@ -995,7 +989,49 @@
     <w:p>
       <w:pPr>
         <w:rPr>
-          <w:lang w:val="en-GB"/>
+          <w:lang w:val="sv-SE"/>
+        </w:rPr>
+      </w:pPr>
+    </w:p>
+    <w:p>
+      <w:pPr>
+        <w:rPr>
+          <w:lang w:val="sv-SE"/>
+        </w:rPr>
+      </w:pPr>
+    </w:p>
+    <w:p>
+      <w:pPr>
+        <w:rPr>
+          <w:lang w:val="sv-SE"/>
+        </w:rPr>
+      </w:pPr>
+    </w:p>
+    <w:p>
+      <w:pPr>
+        <w:rPr>
+          <w:lang w:val="sv-SE"/>
+        </w:rPr>
+      </w:pPr>
+    </w:p>
+    <w:p>
+      <w:pPr>
+        <w:rPr>
+          <w:lang w:val="sv-SE"/>
+        </w:rPr>
+      </w:pPr>
+    </w:p>
+    <w:p>
+      <w:pPr>
+        <w:rPr>
+          <w:lang w:val="sv-SE"/>
+        </w:rPr>
+      </w:pPr>
+    </w:p>
+    <w:p>
+      <w:pPr>
+        <w:rPr>
+          <w:lang w:val="sv-SE"/>
         </w:rPr>
       </w:pPr>
     </w:p>
@@ -1005,6 +1041,55 @@
           <w:lang w:val="en-GB"/>
         </w:rPr>
       </w:pPr>
+      <w:r>
+        <w:rPr>
+          <w:lang w:val="en-GB"/>
+        </w:rPr>
+        <w:lastRenderedPageBreak/>
+        <w:t xml:space="preserve">If going </w:t>
+      </w:r>
+      <w:proofErr w:type="spellStart"/>
+      <w:r>
+        <w:rPr>
+          <w:lang w:val="en-GB"/>
+        </w:rPr>
+        <w:t>bzck</w:t>
+      </w:r>
+      <w:proofErr w:type="spellEnd"/>
+      <w:r>
+        <w:rPr>
+          <w:lang w:val="en-GB"/>
+        </w:rPr>
+        <w:t xml:space="preserve"> (</w:t>
+      </w:r>
+      <w:proofErr w:type="spellStart"/>
+      <w:r>
+        <w:rPr>
+          <w:lang w:val="en-GB"/>
+        </w:rPr>
+        <w:t>butang</w:t>
+      </w:r>
+      <w:proofErr w:type="spellEnd"/>
+      <w:r>
+        <w:rPr>
+          <w:lang w:val="en-GB"/>
+        </w:rPr>
+        <w:t xml:space="preserve"> </w:t>
+      </w:r>
+      <w:proofErr w:type="spellStart"/>
+      <w:r>
+        <w:rPr>
+          <w:lang w:val="en-GB"/>
+        </w:rPr>
+        <w:t>kembali</w:t>
+      </w:r>
+      <w:proofErr w:type="spellEnd"/>
+      <w:r>
+        <w:rPr>
+          <w:lang w:val="en-GB"/>
+        </w:rPr>
+        <w:t>)</w:t>
+      </w:r>
     </w:p>
     <w:p>
       <w:pPr>
@@ -1012,99 +1097,9 @@
           <w:lang w:val="en-GB"/>
         </w:rPr>
       </w:pPr>
-    </w:p>
-    <w:p>
-      <w:pPr>
+      <w:r>
         <w:rPr>
-          <w:lang w:val="en-GB"/>
-        </w:rPr>
-      </w:pPr>
-    </w:p>
-    <w:p>
-      <w:pPr>
-        <w:rPr>
-          <w:lang w:val="en-GB"/>
-        </w:rPr>
-      </w:pPr>
-    </w:p>
-    <w:p>
-      <w:pPr>
-        <w:rPr>
-          <w:lang w:val="en-GB"/>
-        </w:rPr>
-      </w:pPr>
-    </w:p>
-    <w:p>
-      <w:pPr>
-        <w:rPr>
-          <w:lang w:val="en-GB"/>
-        </w:rPr>
-      </w:pPr>
-    </w:p>
-    <w:p>
-      <w:pPr>
-        <w:rPr>
-          <w:lang w:val="en-GB"/>
-        </w:rPr>
-      </w:pPr>
-      <w:r>
-        <w:rPr>
-          <w:lang w:val="en-GB"/>
-        </w:rPr>
-        <w:lastRenderedPageBreak/>
-        <w:t xml:space="preserve">If going </w:t>
-      </w:r>
-      <w:proofErr w:type="spellStart"/>
-      <w:r>
-        <w:rPr>
-          <w:lang w:val="en-GB"/>
-        </w:rPr>
-        <w:t>bzck</w:t>
-      </w:r>
-      <w:proofErr w:type="spellEnd"/>
-      <w:r>
-        <w:rPr>
-          <w:lang w:val="en-GB"/>
-        </w:rPr>
-        <w:t xml:space="preserve"> (</w:t>
-      </w:r>
-      <w:proofErr w:type="spellStart"/>
-      <w:r>
-        <w:rPr>
-          <w:lang w:val="en-GB"/>
-        </w:rPr>
-        <w:t>butang</w:t>
-      </w:r>
-      <w:proofErr w:type="spellEnd"/>
-      <w:r>
-        <w:rPr>
-          <w:lang w:val="en-GB"/>
-        </w:rPr>
-        <w:t xml:space="preserve"> </w:t>
-      </w:r>
-      <w:proofErr w:type="spellStart"/>
-      <w:r>
-        <w:rPr>
-          <w:lang w:val="en-GB"/>
-        </w:rPr>
-        <w:t>kembali</w:t>
-      </w:r>
-      <w:proofErr w:type="spellEnd"/>
-      <w:r>
-        <w:rPr>
-          <w:lang w:val="en-GB"/>
-        </w:rPr>
-        <w:t>)</w:t>
-      </w:r>
-    </w:p>
-    <w:p>
-      <w:pPr>
-        <w:rPr>
-          <w:lang w:val="en-GB"/>
-        </w:rPr>
-      </w:pPr>
-      <w:r>
-        <w:rPr>
+          <w:noProof/>
           <w:lang w:val="en-GB"/>
         </w:rPr>
         <w:drawing>
@@ -1179,9 +1174,17 @@
       </w:pPr>
       <w:r>
         <w:rPr>
+          <w:noProof/>
           <w:lang w:val="sv-SE"/>
         </w:rPr>
         <w:lastRenderedPageBreak/>
+        <w:t>chat</w:t>
+      </w:r>
+      <w:r>
+        <w:rPr>
+          <w:noProof/>
+          <w:lang w:val="sv-SE"/>
+        </w:rPr>
         <w:drawing>
           <wp:inline distT="0" distB="0" distL="0" distR="0" wp14:anchorId="2C347105" wp14:editId="5BDC7CDF">
             <wp:extent cx="5486400" cy="4972050"/>

</xml_diff>